<commit_message>
cambios y mas cambios
</commit_message>
<xml_diff>
--- a/Modelo_de_informe_DEFINITIVO.docx
+++ b/Modelo_de_informe_DEFINITIVO.docx
@@ -2036,7 +2036,7 @@
           <w:rFonts w:ascii="Arial" w:hAnsi="Arial"/>
         </w:rPr>
         <w:drawing>
-          <wp:anchor distT="0" distB="0" distL="0" distR="0" simplePos="0" relativeHeight="8" behindDoc="0" locked="0" layoutInCell="0" allowOverlap="1">
+          <wp:anchor distT="0" distB="0" distL="0" distR="0" simplePos="0" relativeHeight="7" behindDoc="0" locked="0" layoutInCell="0" allowOverlap="1">
             <wp:simplePos x="0" y="0"/>
             <wp:positionH relativeFrom="column">
               <wp:align>center</wp:align>
@@ -2316,7 +2316,7 @@
           <w:rFonts w:ascii="Arial" w:hAnsi="Arial"/>
         </w:rPr>
         <w:drawing>
-          <wp:anchor distT="0" distB="0" distL="0" distR="0" simplePos="0" relativeHeight="9" behindDoc="0" locked="0" layoutInCell="0" allowOverlap="1">
+          <wp:anchor distT="0" distB="0" distL="0" distR="0" simplePos="0" relativeHeight="8" behindDoc="0" locked="0" layoutInCell="0" allowOverlap="1">
             <wp:simplePos x="0" y="0"/>
             <wp:positionH relativeFrom="column">
               <wp:align>center</wp:align>
@@ -2619,7 +2619,7 @@
           <w:rFonts w:ascii="Arial" w:hAnsi="Arial"/>
         </w:rPr>
         <w:drawing>
-          <wp:anchor distT="0" distB="0" distL="0" distR="0" simplePos="0" relativeHeight="4" behindDoc="0" locked="0" layoutInCell="0" allowOverlap="1">
+          <wp:anchor distT="0" distB="0" distL="0" distR="0" simplePos="0" relativeHeight="3" behindDoc="0" locked="0" layoutInCell="0" allowOverlap="1">
             <wp:simplePos x="0" y="0"/>
             <wp:positionH relativeFrom="column">
               <wp:align>center</wp:align>
@@ -2733,7 +2733,7 @@
       <w:bookmarkEnd w:id="20"/>
       <w:r>
         <w:drawing>
-          <wp:anchor distT="0" distB="0" distL="0" distR="0" simplePos="0" relativeHeight="5" behindDoc="0" locked="0" layoutInCell="0" allowOverlap="1">
+          <wp:anchor distT="0" distB="0" distL="0" distR="0" simplePos="0" relativeHeight="4" behindDoc="0" locked="0" layoutInCell="0" allowOverlap="1">
             <wp:simplePos x="0" y="0"/>
             <wp:positionH relativeFrom="column">
               <wp:align>center</wp:align>
@@ -2851,7 +2851,7 @@
       <w:r>
         <w:rPr/>
         <w:drawing>
-          <wp:anchor distT="0" distB="0" distL="0" distR="0" simplePos="0" relativeHeight="10" behindDoc="0" locked="0" layoutInCell="0" allowOverlap="1">
+          <wp:anchor distT="0" distB="0" distL="0" distR="0" simplePos="0" relativeHeight="9" behindDoc="0" locked="0" layoutInCell="0" allowOverlap="1">
             <wp:simplePos x="0" y="0"/>
             <wp:positionH relativeFrom="column">
               <wp:align>center</wp:align>
@@ -2975,7 +2975,7 @@
           <w:rFonts w:ascii="Arial" w:hAnsi="Arial"/>
         </w:rPr>
         <w:drawing>
-          <wp:anchor distT="0" distB="0" distL="0" distR="0" simplePos="0" relativeHeight="11" behindDoc="0" locked="0" layoutInCell="0" allowOverlap="1">
+          <wp:anchor distT="0" distB="0" distL="0" distR="0" simplePos="0" relativeHeight="10" behindDoc="0" locked="0" layoutInCell="0" allowOverlap="1">
             <wp:simplePos x="0" y="0"/>
             <wp:positionH relativeFrom="column">
               <wp:align>center</wp:align>
@@ -3942,7 +3942,15 @@
                 <w:sz w:val="24"/>
                 <w:szCs w:val="24"/>
               </w:rPr>
-              <w:t>Control de respaldos, moderación de usuarios y revisión de reportes.</w:t>
+              <w:t xml:space="preserve">Control de respaldos, moderación de usuarios, revisión de reportes </w:t>
+            </w:r>
+            <w:r>
+              <w:rPr>
+                <w:rFonts w:ascii="Arial" w:hAnsi="Arial"/>
+                <w:sz w:val="24"/>
+                <w:szCs w:val="24"/>
+              </w:rPr>
+              <w:t>y consulta del registro de auditoria de conexiones con las API deportivas y el proveedor LLM.</w:t>
             </w:r>
           </w:p>
         </w:tc>
@@ -4009,10 +4017,12 @@
           <w:rFonts w:ascii="Arial" w:hAnsi="Arial"/>
         </w:rPr>
       </w:pPr>
-      <w:r>
-        <w:rPr>
-          <w:rFonts w:ascii="Arial" w:hAnsi="Arial"/>
-        </w:rPr>
+      <w:r/>
+      <w:r>
+        <w:rPr>
+          <w:rFonts w:ascii="Arial" w:hAnsi="Arial"/>
+        </w:rPr>
+        <w:softHyphen/>
       </w:r>
     </w:p>
     <w:p>
@@ -4444,7 +4454,7 @@
           <w:rFonts w:ascii="Arial" w:hAnsi="Arial"/>
         </w:rPr>
         <w:drawing>
-          <wp:anchor distT="0" distB="0" distL="0" distR="0" simplePos="0" relativeHeight="3" behindDoc="0" locked="0" layoutInCell="0" allowOverlap="1">
+          <wp:anchor distT="0" distB="0" distL="0" distR="0" simplePos="0" relativeHeight="11" behindDoc="0" locked="0" layoutInCell="0" allowOverlap="1">
             <wp:simplePos x="0" y="0"/>
             <wp:positionH relativeFrom="column">
               <wp:align>center</wp:align>
@@ -4452,10 +4462,10 @@
             <wp:positionV relativeFrom="paragraph">
               <wp:posOffset>635</wp:posOffset>
             </wp:positionV>
-            <wp:extent cx="5731510" cy="3408680"/>
+            <wp:extent cx="5731510" cy="5587365"/>
             <wp:effectExtent l="0" t="0" r="0" b="0"/>
             <wp:wrapSquare wrapText="largest"/>
-            <wp:docPr id="7" name="Imagen4"/>
+            <wp:docPr id="7" name="Imagen3"/>
             <wp:cNvGraphicFramePr>
               <a:graphicFrameLocks xmlns:a="http://schemas.openxmlformats.org/drawingml/2006/main" noChangeAspect="1"/>
             </wp:cNvGraphicFramePr>
@@ -4463,13 +4473,14 @@
               <a:graphicData uri="http://schemas.openxmlformats.org/drawingml/2006/picture">
                 <pic:pic xmlns:pic="http://schemas.openxmlformats.org/drawingml/2006/picture">
                   <pic:nvPicPr>
-                    <pic:cNvPr id="7" name="Imagen4"/>
+                    <pic:cNvPr id="7" name="Imagen3"/>
                     <pic:cNvPicPr>
                       <a:picLocks noChangeAspect="1" noChangeArrowheads="1"/>
                     </pic:cNvPicPr>
                   </pic:nvPicPr>
                   <pic:blipFill>
                     <a:blip r:embed="rId8"/>
+                    <a:srcRect l="0" t="0" r="0" b="4984"/>
                     <a:stretch>
                       <a:fillRect/>
                     </a:stretch>
@@ -4477,7 +4488,7 @@
                   <pic:spPr bwMode="auto">
                     <a:xfrm>
                       <a:off x="0" y="0"/>
-                      <a:ext cx="5731510" cy="3408680"/>
+                      <a:ext cx="5731510" cy="5587365"/>
                     </a:xfrm>
                     <a:prstGeom prst="rect">
                       <a:avLst/>
@@ -4489,6 +4500,498 @@
             </a:graphic>
           </wp:anchor>
         </w:drawing>
+      </w:r>
+    </w:p>
+    <w:p>
+      <w:pPr>
+        <w:pStyle w:val="Normal"/>
+        <w:rPr>
+          <w:rFonts w:ascii="Arial" w:hAnsi="Arial"/>
+          <w:b/>
+          <w:bCs/>
+          <w:sz w:val="26"/>
+          <w:szCs w:val="26"/>
+        </w:rPr>
+      </w:pPr>
+      <w:r>
+        <w:rPr>
+          <w:rFonts w:ascii="Arial" w:hAnsi="Arial"/>
+          <w:b/>
+          <w:bCs/>
+          <w:sz w:val="26"/>
+          <w:szCs w:val="26"/>
+        </w:rPr>
+        <w:t>Tablas Base de Datos:</w:t>
+      </w:r>
+    </w:p>
+    <w:p>
+      <w:pPr>
+        <w:pStyle w:val="BodyText"/>
+        <w:rPr>
+          <w:rFonts w:ascii="Arial" w:hAnsi="Arial"/>
+          <w:b w:val="false"/>
+          <w:bCs w:val="false"/>
+          <w:sz w:val="24"/>
+          <w:szCs w:val="24"/>
+        </w:rPr>
+      </w:pPr>
+      <w:r>
+        <w:rPr>
+          <w:rFonts w:ascii="Arial" w:hAnsi="Arial"/>
+          <w:b/>
+          <w:bCs/>
+          <w:sz w:val="24"/>
+          <w:szCs w:val="24"/>
+        </w:rPr>
+        <w:t>BACKUP</w:t>
+      </w:r>
+      <w:r>
+        <w:rPr>
+          <w:rFonts w:ascii="Arial" w:hAnsi="Arial"/>
+          <w:b w:val="false"/>
+          <w:bCs w:val="false"/>
+          <w:sz w:val="24"/>
+          <w:szCs w:val="24"/>
+        </w:rPr>
+        <w:t>(id_backup (PK), fecha, ruta_archivo, estado)</w:t>
+      </w:r>
+    </w:p>
+    <w:p>
+      <w:pPr>
+        <w:pStyle w:val="BodyText"/>
+        <w:rPr>
+          <w:rFonts w:ascii="Arial" w:hAnsi="Arial"/>
+          <w:sz w:val="24"/>
+          <w:szCs w:val="24"/>
+        </w:rPr>
+      </w:pPr>
+      <w:r>
+        <w:rPr>
+          <w:rFonts w:ascii="Arial" w:hAnsi="Arial"/>
+          <w:b/>
+          <w:bCs/>
+          <w:sz w:val="24"/>
+          <w:szCs w:val="24"/>
+        </w:rPr>
+        <w:t>USUARIO</w:t>
+      </w:r>
+      <w:r>
+        <w:rPr>
+          <w:rFonts w:ascii="Arial" w:hAnsi="Arial"/>
+          <w:sz w:val="24"/>
+          <w:szCs w:val="24"/>
+        </w:rPr>
+        <w:t>(id_usuario (PK), correo, contraseña_hash, nombre_usuario, es_admin, fecha_registro)</w:t>
+      </w:r>
+    </w:p>
+    <w:p>
+      <w:pPr>
+        <w:pStyle w:val="BodyText"/>
+        <w:rPr>
+          <w:rFonts w:ascii="Arial" w:hAnsi="Arial"/>
+          <w:sz w:val="24"/>
+          <w:szCs w:val="24"/>
+        </w:rPr>
+      </w:pPr>
+      <w:r>
+        <w:rPr>
+          <w:rFonts w:ascii="Arial" w:hAnsi="Arial"/>
+          <w:b/>
+          <w:bCs/>
+          <w:sz w:val="24"/>
+          <w:szCs w:val="24"/>
+        </w:rPr>
+        <w:t>REPORTE</w:t>
+      </w:r>
+      <w:r>
+        <w:rPr>
+          <w:rFonts w:ascii="Arial" w:hAnsi="Arial"/>
+          <w:sz w:val="24"/>
+          <w:szCs w:val="24"/>
+        </w:rPr>
+        <w:t>(id_reporte (PK), id_usuario (FK), descripcion, fecha, estado)</w:t>
+      </w:r>
+    </w:p>
+    <w:p>
+      <w:pPr>
+        <w:pStyle w:val="BodyText"/>
+        <w:rPr>
+          <w:rFonts w:ascii="Arial" w:hAnsi="Arial"/>
+          <w:sz w:val="24"/>
+          <w:szCs w:val="24"/>
+        </w:rPr>
+      </w:pPr>
+      <w:r>
+        <w:rPr>
+          <w:rFonts w:ascii="Arial" w:hAnsi="Arial"/>
+          <w:b/>
+          <w:bCs/>
+          <w:sz w:val="24"/>
+          <w:szCs w:val="24"/>
+        </w:rPr>
+        <w:t>NOTICIA</w:t>
+      </w:r>
+      <w:r>
+        <w:rPr>
+          <w:rFonts w:ascii="Arial" w:hAnsi="Arial"/>
+          <w:sz w:val="24"/>
+          <w:szCs w:val="24"/>
+        </w:rPr>
+        <w:t>(id_noticia (PK), titulo, contenido, fecha)</w:t>
+      </w:r>
+    </w:p>
+    <w:p>
+      <w:pPr>
+        <w:pStyle w:val="BodyText"/>
+        <w:rPr>
+          <w:rFonts w:ascii="Arial" w:hAnsi="Arial"/>
+          <w:sz w:val="24"/>
+          <w:szCs w:val="24"/>
+        </w:rPr>
+      </w:pPr>
+      <w:r>
+        <w:rPr>
+          <w:rFonts w:ascii="Arial" w:hAnsi="Arial"/>
+          <w:b/>
+          <w:bCs/>
+          <w:sz w:val="24"/>
+          <w:szCs w:val="24"/>
+        </w:rPr>
+        <w:t>EQUIPO</w:t>
+      </w:r>
+      <w:r>
+        <w:rPr>
+          <w:rFonts w:ascii="Arial" w:hAnsi="Arial"/>
+          <w:sz w:val="24"/>
+          <w:szCs w:val="24"/>
+        </w:rPr>
+        <w:t>(id_equipo (PK), nombre, escudo_url, pais, estadio, director_tecnico)</w:t>
+      </w:r>
+    </w:p>
+    <w:p>
+      <w:pPr>
+        <w:pStyle w:val="BodyText"/>
+        <w:rPr>
+          <w:rFonts w:ascii="Arial" w:hAnsi="Arial"/>
+          <w:sz w:val="24"/>
+          <w:szCs w:val="24"/>
+        </w:rPr>
+      </w:pPr>
+      <w:r>
+        <w:rPr>
+          <w:rFonts w:ascii="Arial" w:hAnsi="Arial"/>
+          <w:b/>
+          <w:bCs/>
+          <w:sz w:val="24"/>
+          <w:szCs w:val="24"/>
+        </w:rPr>
+        <w:t>JUGADOR</w:t>
+      </w:r>
+      <w:r>
+        <w:rPr>
+          <w:rFonts w:ascii="Arial" w:hAnsi="Arial"/>
+          <w:sz w:val="24"/>
+          <w:szCs w:val="24"/>
+        </w:rPr>
+        <w:t>(id_jugador (PK), id_equipo (FK), nombre, posicion, nacionalidad, estadisticas_temporada)</w:t>
+      </w:r>
+    </w:p>
+    <w:p>
+      <w:pPr>
+        <w:pStyle w:val="BodyText"/>
+        <w:rPr>
+          <w:rFonts w:ascii="Arial" w:hAnsi="Arial"/>
+          <w:sz w:val="24"/>
+          <w:szCs w:val="24"/>
+        </w:rPr>
+      </w:pPr>
+      <w:r>
+        <w:rPr>
+          <w:rFonts w:ascii="Arial" w:hAnsi="Arial"/>
+          <w:b/>
+          <w:bCs/>
+          <w:sz w:val="24"/>
+          <w:szCs w:val="24"/>
+        </w:rPr>
+        <w:t>COMPETICION</w:t>
+      </w:r>
+      <w:r>
+        <w:rPr>
+          <w:rFonts w:ascii="Arial" w:hAnsi="Arial"/>
+          <w:sz w:val="24"/>
+          <w:szCs w:val="24"/>
+        </w:rPr>
+        <w:t>(id_competicion (PK), nombre, temporada, pais)</w:t>
+      </w:r>
+    </w:p>
+    <w:p>
+      <w:pPr>
+        <w:pStyle w:val="BodyText"/>
+        <w:rPr>
+          <w:rFonts w:ascii="Arial" w:hAnsi="Arial"/>
+          <w:sz w:val="24"/>
+          <w:szCs w:val="24"/>
+        </w:rPr>
+      </w:pPr>
+      <w:r>
+        <w:rPr>
+          <w:rFonts w:ascii="Arial" w:hAnsi="Arial"/>
+          <w:b/>
+          <w:bCs/>
+          <w:sz w:val="24"/>
+          <w:szCs w:val="24"/>
+        </w:rPr>
+        <w:t>COPA</w:t>
+      </w:r>
+      <w:r>
+        <w:rPr>
+          <w:rFonts w:ascii="Arial" w:hAnsi="Arial"/>
+          <w:sz w:val="24"/>
+          <w:szCs w:val="24"/>
+        </w:rPr>
+        <w:t>(id_competicion (PK, FK), existen_vueltas)</w:t>
+      </w:r>
+    </w:p>
+    <w:p>
+      <w:pPr>
+        <w:pStyle w:val="BodyText"/>
+        <w:rPr>
+          <w:rFonts w:ascii="Arial" w:hAnsi="Arial"/>
+          <w:sz w:val="24"/>
+          <w:szCs w:val="24"/>
+        </w:rPr>
+      </w:pPr>
+      <w:r>
+        <w:rPr>
+          <w:rFonts w:ascii="Arial" w:hAnsi="Arial"/>
+          <w:b/>
+          <w:bCs/>
+          <w:sz w:val="24"/>
+          <w:szCs w:val="24"/>
+        </w:rPr>
+        <w:t>LIGA</w:t>
+      </w:r>
+      <w:r>
+        <w:rPr>
+          <w:rFonts w:ascii="Arial" w:hAnsi="Arial"/>
+          <w:sz w:val="24"/>
+          <w:szCs w:val="24"/>
+        </w:rPr>
+        <w:t>(id_competicion (PK, FK), cantidad_fechas, formato_texto)</w:t>
+      </w:r>
+    </w:p>
+    <w:p>
+      <w:pPr>
+        <w:pStyle w:val="BodyText"/>
+        <w:rPr>
+          <w:rFonts w:ascii="Arial" w:hAnsi="Arial"/>
+          <w:sz w:val="24"/>
+          <w:szCs w:val="24"/>
+        </w:rPr>
+      </w:pPr>
+      <w:r>
+        <w:rPr>
+          <w:rFonts w:ascii="Arial" w:hAnsi="Arial"/>
+          <w:b/>
+          <w:bCs/>
+          <w:sz w:val="24"/>
+          <w:szCs w:val="24"/>
+        </w:rPr>
+        <w:t>PARTIDO</w:t>
+      </w:r>
+      <w:r>
+        <w:rPr>
+          <w:rFonts w:ascii="Arial" w:hAnsi="Arial"/>
+          <w:sz w:val="24"/>
+          <w:szCs w:val="24"/>
+        </w:rPr>
+        <w:t>(id_partido (PK), id_competicion (FK), hora_inicio, estado, resultado_local, resultado_visitante, minuto_juego, arbitro)</w:t>
+      </w:r>
+    </w:p>
+    <w:p>
+      <w:pPr>
+        <w:pStyle w:val="BodyText"/>
+        <w:rPr>
+          <w:rFonts w:ascii="Arial" w:hAnsi="Arial"/>
+          <w:sz w:val="24"/>
+          <w:szCs w:val="24"/>
+        </w:rPr>
+      </w:pPr>
+      <w:r>
+        <w:rPr>
+          <w:rFonts w:ascii="Arial" w:hAnsi="Arial"/>
+          <w:b/>
+          <w:bCs/>
+          <w:sz w:val="24"/>
+          <w:szCs w:val="24"/>
+        </w:rPr>
+        <w:t>EVENTO</w:t>
+      </w:r>
+      <w:r>
+        <w:rPr>
+          <w:rFonts w:ascii="Arial" w:hAnsi="Arial"/>
+          <w:sz w:val="24"/>
+          <w:szCs w:val="24"/>
+        </w:rPr>
+        <w:t>(id_partido (PK, FK), nro_evento (PK), tipo, descripcion, minuto, origen, fecha_registro)</w:t>
+      </w:r>
+    </w:p>
+    <w:p>
+      <w:pPr>
+        <w:pStyle w:val="BodyText"/>
+        <w:rPr>
+          <w:rFonts w:ascii="Arial" w:hAnsi="Arial"/>
+          <w:sz w:val="24"/>
+          <w:szCs w:val="24"/>
+        </w:rPr>
+      </w:pPr>
+      <w:r>
+        <w:rPr>
+          <w:rFonts w:ascii="Arial" w:hAnsi="Arial"/>
+          <w:b/>
+          <w:bCs/>
+          <w:sz w:val="24"/>
+          <w:szCs w:val="24"/>
+        </w:rPr>
+        <w:t>HISTORIAL</w:t>
+      </w:r>
+      <w:r>
+        <w:rPr>
+          <w:rFonts w:ascii="Arial" w:hAnsi="Arial"/>
+          <w:sz w:val="24"/>
+          <w:szCs w:val="24"/>
+        </w:rPr>
+        <w:t>(id_partido (PK, FK), timestamp (PK), prob_local, prob_visitante, prob_empate)</w:t>
+      </w:r>
+    </w:p>
+    <w:p>
+      <w:pPr>
+        <w:pStyle w:val="BodyText"/>
+        <w:rPr>
+          <w:rFonts w:ascii="Arial" w:hAnsi="Arial"/>
+          <w:sz w:val="24"/>
+          <w:szCs w:val="24"/>
+        </w:rPr>
+      </w:pPr>
+      <w:r>
+        <w:rPr>
+          <w:rFonts w:ascii="Arial" w:hAnsi="Arial"/>
+          <w:b/>
+          <w:bCs/>
+          <w:sz w:val="24"/>
+          <w:szCs w:val="24"/>
+        </w:rPr>
+        <w:t>USUARIO_EQUIPO_SUB</w:t>
+      </w:r>
+      <w:r>
+        <w:rPr>
+          <w:rFonts w:ascii="Arial" w:hAnsi="Arial"/>
+          <w:sz w:val="24"/>
+          <w:szCs w:val="24"/>
+        </w:rPr>
+        <w:t>(id_usuario (PK, FK), id_equipo (PK, FK), tipo_alerta, chat_id_telegram)</w:t>
+      </w:r>
+    </w:p>
+    <w:p>
+      <w:pPr>
+        <w:pStyle w:val="BodyText"/>
+        <w:rPr>
+          <w:rFonts w:ascii="Arial" w:hAnsi="Arial"/>
+          <w:sz w:val="24"/>
+          <w:szCs w:val="24"/>
+        </w:rPr>
+      </w:pPr>
+      <w:r>
+        <w:rPr>
+          <w:rFonts w:ascii="Arial" w:hAnsi="Arial"/>
+          <w:b/>
+          <w:bCs/>
+          <w:sz w:val="24"/>
+          <w:szCs w:val="24"/>
+        </w:rPr>
+        <w:t>NOTICIA_EQUIPO_SOBRE</w:t>
+      </w:r>
+      <w:r>
+        <w:rPr>
+          <w:rFonts w:ascii="Arial" w:hAnsi="Arial"/>
+          <w:sz w:val="24"/>
+          <w:szCs w:val="24"/>
+        </w:rPr>
+        <w:t>(id_noticia (PK, FK), id_equipo (PK, FK))</w:t>
+      </w:r>
+    </w:p>
+    <w:p>
+      <w:pPr>
+        <w:pStyle w:val="BodyText"/>
+        <w:rPr>
+          <w:rFonts w:ascii="Arial" w:hAnsi="Arial"/>
+          <w:b w:val="false"/>
+          <w:bCs w:val="false"/>
+          <w:sz w:val="24"/>
+          <w:szCs w:val="24"/>
+        </w:rPr>
+      </w:pPr>
+      <w:r>
+        <w:rPr>
+          <w:rFonts w:ascii="Arial" w:hAnsi="Arial"/>
+          <w:b/>
+          <w:bCs/>
+          <w:sz w:val="24"/>
+          <w:szCs w:val="24"/>
+        </w:rPr>
+        <w:t>JUEGA</w:t>
+      </w:r>
+      <w:r>
+        <w:rPr>
+          <w:rFonts w:ascii="Arial" w:hAnsi="Arial"/>
+          <w:b w:val="false"/>
+          <w:bCs w:val="false"/>
+          <w:sz w:val="24"/>
+          <w:szCs w:val="24"/>
+        </w:rPr>
+        <w:t xml:space="preserve">(id_equipo (PK, FK), id_partido (PK, FK), tipo) </w:t>
+      </w:r>
+    </w:p>
+    <w:p>
+      <w:pPr>
+        <w:pStyle w:val="Normal"/>
+        <w:rPr>
+          <w:rFonts w:ascii="Arial" w:hAnsi="Arial"/>
+          <w:b w:val="false"/>
+          <w:bCs w:val="false"/>
+          <w:sz w:val="24"/>
+          <w:szCs w:val="24"/>
+        </w:rPr>
+      </w:pPr>
+      <w:r>
+        <w:rPr>
+          <w:rFonts w:ascii="Arial" w:hAnsi="Arial"/>
+          <w:b w:val="false"/>
+          <w:bCs w:val="false"/>
+          <w:sz w:val="24"/>
+          <w:szCs w:val="24"/>
+        </w:rPr>
+      </w:r>
+    </w:p>
+    <w:p>
+      <w:pPr>
+        <w:pStyle w:val="Normal"/>
+        <w:rPr>
+          <w:rFonts w:ascii="Arial" w:hAnsi="Arial"/>
+          <w:b w:val="false"/>
+          <w:bCs w:val="false"/>
+          <w:sz w:val="24"/>
+          <w:szCs w:val="24"/>
+        </w:rPr>
+      </w:pPr>
+      <w:r>
+        <w:rPr>
+          <w:rFonts w:ascii="Arial" w:hAnsi="Arial"/>
+          <w:b w:val="false"/>
+          <w:bCs w:val="false"/>
+          <w:sz w:val="24"/>
+          <w:szCs w:val="24"/>
+        </w:rPr>
       </w:r>
     </w:p>
     <w:p>

</xml_diff>